<commit_message>
Consistencia: Guia 2.2 alineada al set CP001-CP004; CP002 e IDs segun evidencia; RQ-07 en Plan/Guia; README Caso B
</commit_message>
<xml_diff>
--- a/Mis_Entregables/U2.1_Plan_Maestro/Plan_Maestro_de_Pruebas_Unidad_2_FUSIONADO_Grupo1.docx
+++ b/Mis_Entregables/U2.1_Plan_Maestro/Plan_Maestro_de_Pruebas_Unidad_2_FUSIONADO_Grupo1.docx
@@ -3127,6 +3127,58 @@
           </w:p>
         </w:tc>
       </w:tr>
+      <w:tr>
+        <w:tc>
+          <w:tcPr>
+            <w:tcW w:type="dxa" w:w="1994"/>
+          </w:tcPr>
+          <w:p>
+            <w:r>
+              <w:t>RQ 07</w:t>
+            </w:r>
+          </w:p>
+        </w:tc>
+        <w:tc>
+          <w:tcPr>
+            <w:tcW w:type="dxa" w:w="1994"/>
+          </w:tcPr>
+          <w:p>
+            <w:r>
+              <w:t>Registro de pacientes con validaciones de formulario</w:t>
+            </w:r>
+          </w:p>
+        </w:tc>
+        <w:tc>
+          <w:tcPr>
+            <w:tcW w:type="dxa" w:w="1994"/>
+          </w:tcPr>
+          <w:p>
+            <w:r>
+              <w:t>Funcional</w:t>
+            </w:r>
+          </w:p>
+        </w:tc>
+        <w:tc>
+          <w:tcPr>
+            <w:tcW w:type="dxa" w:w="1994"/>
+          </w:tcPr>
+          <w:p>
+            <w:r>
+              <w:t>Corrección funcional (ISO 25010): solo se guarda un paciente con datos válidos (formato de RUT, nombre y apellidos de 2 a 50 caracteres, email válido, fecha no futura, sexo M/F/O y sin duplicar RUT/email); ante un dato inválido responde 400 con detalle y no guarda. Ejecutado: CP001-CP004 con 4/4 Pass (bitácora 2.3).</w:t>
+            </w:r>
+          </w:p>
+        </w:tc>
+        <w:tc>
+          <w:tcPr>
+            <w:tcW w:type="dxa" w:w="1994"/>
+          </w:tcPr>
+          <w:p>
+            <w:r>
+              <w:t>ERS RF-2 / BACKEND/src/validations/pacientes.js</w:t>
+            </w:r>
+          </w:p>
+        </w:tc>
+      </w:tr>
     </w:tbl>
     <w:p>
       <w:pPr>
@@ -3433,7 +3485,7 @@
           </w:tcPr>
           <w:p>
             <w:r>
-              <w:t>Es el flujo crítico del negocio y concentra las reglas de validación (formato de RUT, nombre de 2 a 50 letras, email, fecha no futura, sexo M/F/O, duplicados). Vinculado a RQ-01 a RQ-03 y al riesgo RS-01.</w:t>
+              <w:t>Es el flujo crítico del negocio y concentra las reglas de validación (formato de RUT, nombre de 2 a 50 letras, email, fecha no futura, sexo M/F/O, duplicados). Vinculado a RQ-07, RQ-03 y al riesgo RS-01.</w:t>
             </w:r>
           </w:p>
         </w:tc>
@@ -3739,7 +3791,7 @@
           </w:tcPr>
           <w:p>
             <w:r>
-              <w:t>Lo usan pacientes y personal de salud con poco tiempo. Vinculado a RQ-05.</w:t>
+              <w:t>Lo usan pacientes y personal de salud con poco tiempo. Vinculado a RQ-07.</w:t>
             </w:r>
           </w:p>
         </w:tc>
@@ -4196,7 +4248,7 @@
                 <w:szCs w:val="18"/>
                 <w:rtl w:val="0"/>
               </w:rPr>
-              <w:t xml:space="preserve">Verificación de cifrado en tránsito (HTTPS/TLS) y hash de claves con </w:t>
+              <w:t>Verificación de cifrado en tránsito (HTTPS/TLS) y hash de claves</w:t>
             </w:r>
           </w:p>
         </w:tc>
@@ -6332,7 +6384,7 @@
           </w:tcPr>
           <w:p>
             <w:r>
-              <w:t>RQ-01</w:t>
+              <w:t>RQ-07</w:t>
             </w:r>
           </w:p>
         </w:tc>
@@ -6394,7 +6446,7 @@
           </w:tcPr>
           <w:p>
             <w:r>
-              <w:t>RQ-02</w:t>
+              <w:t>RQ-07</w:t>
             </w:r>
           </w:p>
         </w:tc>
@@ -6404,7 +6456,7 @@
           </w:tcPr>
           <w:p>
             <w:r>
-              <w:t>Registro con RUT y email inválidos (dato inválido 2.3)</w:t>
+              <w:t>Registro con email inválido (dato inválido 2.3)</w:t>
             </w:r>
           </w:p>
         </w:tc>
@@ -6414,7 +6466,7 @@
           </w:tcPr>
           <w:p>
             <w:r>
-              <w:t>1. Login como médico. 2. POST /pacientes con RUT 1234 y email juan@.</w:t>
+              <w:t>1. Login como médico. 2. POST /pacientes con RUT válido (9.876.543-2) y email sin @ (correosinarroba).</w:t>
             </w:r>
           </w:p>
         </w:tc>
@@ -6424,7 +6476,7 @@
           </w:tcPr>
           <w:p>
             <w:r>
-              <w:t>400, no guarda. Mensaje de formato de RUT y email.</w:t>
+              <w:t>400, no guarda. Mensaje de formato de email ("El email debe tener un formato válido").</w:t>
             </w:r>
           </w:p>
         </w:tc>
@@ -6456,7 +6508,7 @@
           </w:tcPr>
           <w:p>
             <w:r>
-              <w:t>RQ-02</w:t>
+              <w:t>RQ-07</w:t>
             </w:r>
           </w:p>
         </w:tc>
@@ -6518,7 +6570,7 @@
           </w:tcPr>
           <w:p>
             <w:r>
-              <w:t>RQ-02</w:t>
+              <w:t>RQ-07</w:t>
             </w:r>
           </w:p>
         </w:tc>

</xml_diff>

<commit_message>
U2.1: alinea Plan Maestro FUSIONADO (RQ-05 y alcance ajustados; CP005-CP008 con resultados de ejecucion)
</commit_message>
<xml_diff>
--- a/Mis_Entregables/U2.1_Plan_Maestro/Plan_Maestro_de_Pruebas_Unidad_2_FUSIONADO_Grupo1.docx
+++ b/Mis_Entregables/U2.1_Plan_Maestro/Plan_Maestro_de_Pruebas_Unidad_2_FUSIONADO_Grupo1.docx
@@ -68,7 +68,7 @@
     <w:p>
       <w:pPr/>
       <w:r>
-        <w:t>Versión fusionada del equipo (Grupo 1, 06-10-2026): integra el avance de Gerardo Vera (25-09-2026) con el avance, los casos verificados y la bitácora de ejecución de Benjamín Ibáñez (29-09 al 06-10-2026).</w:t>
+        <w:t>Versión fusionada del equipo (Grupo 1, 06-10-2026): integra el avance de Gerardo Vera (25-09-2026) con el avance, los casos verificados y la bitácora de ejecución de Benjamín Ibáñez (29-09 al 06-10-2026). Actualizada 16-10-2026: RQ-07 y resultados de ejecución CP005-CP008 incorporados.</w:t>
       </w:r>
     </w:p>
     <w:tbl>
@@ -763,15 +763,7 @@
                 <w:szCs w:val="18"/>
                 <w:rtl w:val="0"/>
               </w:rPr>
-              <w:t xml:space="preserve">CodigoFuenteB_cuidarte</w:t>
-            </w:r>
-            <w:r>
-              <w:rPr>
-                <w:sz w:val="18"/>
-                <w:szCs w:val="18"/>
-                <w:rtl w:val="0"/>
-              </w:rPr>
-              <w:t xml:space="preserve"> /FRONTEND</w:t>
+              <w:t xml:space="preserve">CodigoFuenteB_cuidarte /FRONTEND</w:t>
             </w:r>
           </w:p>
           <w:p>
@@ -882,23 +874,7 @@
                 <w:szCs w:val="18"/>
                 <w:rtl w:val="0"/>
               </w:rPr>
-              <w:t xml:space="preserve">API RESTful en </w:t>
-            </w:r>
-            <w:r>
-              <w:rPr>
-                <w:sz w:val="18"/>
-                <w:szCs w:val="18"/>
-                <w:rtl w:val="0"/>
-              </w:rPr>
-              <w:t xml:space="preserve">Node.js/Express</w:t>
-            </w:r>
-            <w:r>
-              <w:rPr>
-                <w:sz w:val="18"/>
-                <w:szCs w:val="18"/>
-                <w:rtl w:val="0"/>
-              </w:rPr>
-              <w:t xml:space="preserve"> basada en arquitectura JSON. Corren en el contenedor llamado ”cuidarteplusbackend-ev”.</w:t>
+              <w:t xml:space="preserve">API RESTful en Node.js/Express basada en arquitectura JSON. Corren en el contenedor llamado ”cuidarteplusbackend-ev”.</w:t>
             </w:r>
             <w:r>
               <w:rPr>
@@ -1729,7 +1705,7 @@
                 <w:szCs w:val="18"/>
                 <w:rtl w:val="0"/>
               </w:rPr>
-              <w:t xml:space="preserve">Módulos de autenticación(JWT),control de acceso(RBAC),CRUD de pacientes y exámenes médicos, carga y descarga de archivos adjuntos,registro inalterable de auditoría, pruebas de carga de hasta 200 usuarios de manera concurrentes y análisis de vulnerabilidades API/Web. </w:t>
+              <w:t xml:space="preserve">Módulos de autenticación(JWT),control de acceso(RBAC),CRUD de pacientes y exámenes médicos, carga y descarga de archivos adjuntos,registro de auditoría y revisión de seguridad API/Web (OWASP Top 10 manual). </w:t>
             </w:r>
             <w:r>
               <w:rPr>
@@ -1858,7 +1834,7 @@
           </w:tcPr>
           <w:p>
             <w:r>
-              <w:t>Aprobar el 100% de los casos críticos ejecutados en esta etapa (CP001-CP004) con evidencia trazable, y registrar como hallazgo o incidencia toda desviación encontrada (contraseñas en texto plano, delay de 5 s en listados, RUT sin dígito verificador, JWT sin revocación). Las metas de 0 vulnerabilidades altas/críticas, 95% de CRUD bajo 300 ms y 200 usuarios concurrentes quedan fuera del alcance de esta unidad y se reevaluarán en la Unidad 2.4 con plan de corrección.</w:t>
+              <w:t>Aprobar el 100% de los casos críticos ejecutados en esta etapa (CP001-CP004) con evidencia trazable, y registrar como hallazgo o incidencia toda desviación encontrada (contraseñas en texto plano, delay de 5 s en listados, RUT sin dígito verificador, JWT sin revocación). Las metas de 0 vulnerabilidades altas/críticas, 95% de CRUD bajo 300 ms y 200 usuarios concurrentes quedan fuera del alcance de esta unidad y se reevaluarán con el plan de corrección (ver Informe de Certificación 2.4).</w:t>
             </w:r>
           </w:p>
         </w:tc>
@@ -3031,7 +3007,7 @@
                 <w:szCs w:val="18"/>
                 <w:rtl w:val="0"/>
               </w:rPr>
-              <w:t xml:space="preserve">Seguridad(Trazabilidad): Generación inalterable de logs ante cualquier creación, modificación, eliminación o descarga indicando autor y marca tiempo.</w:t>
+              <w:t xml:space="preserve">Seguridad(Trazabilidad): Registro de eventos (creación, modificación, eliminación o descarga) con autor y marca de tiempo, verificado en código (inserts de auditoría en auth.js, pacientes.js, examenes.js y documentos.js); la inalterabilidad no se probó en esta etapa.</w:t>
             </w:r>
             <w:r>
               <w:rPr>
@@ -3607,7 +3583,7 @@
           </w:tcPr>
           <w:p>
             <w:r>
-              <w:t>Cronómetro + DevTools (pestaña red) + JMeter solo para medición puntual (la prueba de 200 concurrentes queda para la Unidad 2.4)</w:t>
+              <w:t>Cronómetro + DevTools (pestaña red) + JMeter solo para medición puntual (la prueba de 200 concurrentes quedó fuera de alcance; ver limitaciones del Informe 2.4)</w:t>
             </w:r>
           </w:p>
         </w:tc>
@@ -3709,7 +3685,7 @@
           </w:tcPr>
           <w:p>
             <w:r>
-              <w:t>Revisión manual + Swagger; escaneo DAST con OWASP ZAP pendiente para la Unidad 2.4</w:t>
+              <w:t>Revisión manual + Swagger; escaneo DAST con OWASP ZAP no ejecutado (recomendación del Informe 2.4)</w:t>
             </w:r>
           </w:p>
         </w:tc>
@@ -4420,25 +4396,7 @@
                 <w:highlight w:val="white"/>
                 <w:rtl w:val="0"/>
               </w:rPr>
-              <w:t xml:space="preserve">Respuestas HTTP </w:t>
-            </w:r>
-            <w:r>
-              <w:rPr>
-                <w:sz w:val="18"/>
-                <w:szCs w:val="18"/>
-                <w:highlight w:val="white"/>
-                <w:rtl w:val="0"/>
-              </w:rPr>
-              <w:t xml:space="preserve">403 Forbidden</w:t>
-            </w:r>
-            <w:r>
-              <w:rPr>
-                <w:sz w:val="18"/>
-                <w:szCs w:val="18"/>
-                <w:highlight w:val="white"/>
-                <w:rtl w:val="0"/>
-              </w:rPr>
-              <w:t xml:space="preserve"> ante intentos de acceso no autorizado. </w:t>
+              <w:t xml:space="preserve">Respuestas HTTP 403 Forbidden ante intentos de acceso no autorizado. </w:t>
             </w:r>
           </w:p>
         </w:tc>
@@ -4577,23 +4535,7 @@
                 <w:szCs w:val="18"/>
                 <w:rtl w:val="0"/>
               </w:rPr>
-              <w:t xml:space="preserve">Registros de la tabla </w:t>
-            </w:r>
-            <w:r>
-              <w:rPr>
-                <w:sz w:val="18"/>
-                <w:szCs w:val="18"/>
-                <w:rtl w:val="0"/>
-              </w:rPr>
-              <w:t xml:space="preserve">auditoria</w:t>
-            </w:r>
-            <w:r>
-              <w:rPr>
-                <w:sz w:val="18"/>
-                <w:szCs w:val="18"/>
-                <w:rtl w:val="0"/>
-              </w:rPr>
-              <w:t xml:space="preserve"> con timestamp, usuario y acción realizada. </w:t>
+              <w:t xml:space="preserve">Registros de la tabla auditoria con timestamp, usuario y acción realizada. </w:t>
             </w:r>
           </w:p>
         </w:tc>
@@ -6672,7 +6614,7 @@
           </w:tcPr>
           <w:p>
             <w:r>
-              <w:t>Funcional/Seguridad - Pendiente Unidad 2.4</w:t>
+              <w:t>Funcional/Seguridad - Ejecutado 16-10-2026: Pass (Grupo1_CP005_Login_200.json; Grupo1_CP005_Uso_token_lista_pacientes_200.json)</w:t>
             </w:r>
           </w:p>
         </w:tc>
@@ -6724,7 +6666,7 @@
           </w:tcPr>
           <w:p>
             <w:r>
-              <w:t>Esperado según diseño: 401 Unauthorized. Nota: el sistema no tiene logout ni revocación y el JWT dura 2 h, por lo que probablemente el token siga vigente; ejecutar para confirmar y levantar DEF si se confirma.</w:t>
+              <w:t>Esperado según diseño: 401 Unauthorized. Nota: el sistema no tiene logout ni revocación y el JWT dura 2 h. Ejecutado 16-10-2026: el token siguió vigente tras cerrar sesión (200 en vez de 401) y se levanta el hallazgo H-02 (ver Informe de Certificación).</w:t>
             </w:r>
           </w:p>
         </w:tc>
@@ -6734,7 +6676,7 @@
           </w:tcPr>
           <w:p>
             <w:r>
-              <w:t>Seguridad - Pendiente Unidad 2.4</w:t>
+              <w:t>Seguridad - Ejecutado 16-10-2026: Fail (confirma H-02; Grupo1_CP006_Reuso_token_tras_logout_200.json)</w:t>
             </w:r>
           </w:p>
         </w:tc>
@@ -6796,7 +6738,7 @@
           </w:tcPr>
           <w:p>
             <w:r>
-              <w:t>Seguridad/RBAC - Pendiente Unidad 2.4</w:t>
+              <w:t>Seguridad/RBAC - Ejecutado 16-10-2026: Pass (403 y BD sin cambios; Grupo1_CP007_PUT_403.json)</w:t>
             </w:r>
           </w:p>
         </w:tc>
@@ -6858,7 +6800,7 @@
           </w:tcPr>
           <w:p>
             <w:r>
-              <w:t>Funcional - Pendiente Unidad 2.4</w:t>
+              <w:t>Funcional - Ejecutado 16-10-2026: Pass (descarga íntegra, SHA256 idéntico; Grupo1_CP008_Integridad_y_tiempo.txt)</w:t>
             </w:r>
           </w:p>
         </w:tc>

</xml_diff>